<commit_message>
BA: Session 15.10.2026 -- Testdurchlaeufe vorbereitet, Arbeitsprotokoll, Daily Note
Co-Authored-By: Claude Opus 5.5 <noreply@anthropic.com>
</commit_message>
<xml_diff>
--- a/02 Projekte/Bachelorarbeit/Testdurchläufe/Testfälle Testdurchläufe.docx
+++ b/02 Projekte/Bachelorarbeit/Testdurchläufe/Testfälle Testdurchläufe.docx
@@ -26,7 +26,7 @@
           <w:b w:val="0"/>
           <w:i w:val="0"/>
         </w:rPr>
-        <w:t>Bachelorarbeit Dennis Sacher, Evaluation (Kapitel 6). Stand: 12.10.2026</w:t>
+        <w:t>Bachelorarbeit Dennis Sacher, Evaluation (Kapitel 6). Stand: 15.10.2026</w:t>
       </w:r>
     </w:p>
     <w:p>
@@ -350,7 +350,7 @@
               <w:rPr>
                 <w:sz w:val="19"/>
               </w:rPr>
-              <w:t>Angaben von Hand in den TSM-Ersatz abtippen</w:t>
+              <w:t>Angaben von Hand ins TSM abtippen (im Test nicht nachgestellt, Dauer im Betrieb beobachtet, siehe 3.5)</w:t>
             </w:r>
           </w:p>
         </w:tc>
@@ -409,7 +409,7 @@
               <w:rPr>
                 <w:sz w:val="19"/>
               </w:rPr>
-              <w:t>Solange die Schnittstelle fehlt, müsste die BayFu auch mit dem neuen System von Hand ins TSM abtippen. Bei TF 1 und TF 6 tippt die CC-Person deshalb auf dem neuen Weg zusätzlich in den TSM-Ersatz. Daraus ergeben sich drei Werte: alt, neu heute (mit Abtippen) und neu mit Schnittstelle (ohne Abtippen).</w:t>
+              <w:t>Solange die Schnittstelle fehlt, müsste die BayFu auch mit dem neuen System von Hand ins TSM abtippen. Weil Testdaten nicht ins TSM dürfen, wird das Abtippen nicht in den Testfällen gemessen, sondern im laufenden Betrieb beobachtet (Abschnitt 3.5). Daraus ergeben sich drei Werte: alt (mit beobachteter Abtippzeit), neu heute (neu plus beobachtete Abtippzeit) und neu mit Schnittstelle (ohne Abtippen). Für „neu heute“ gilt die Annahme, dass das Abtippen aus dem CC-Panel etwa so lange dauert wie aus dem Template.</w:t>
             </w:r>
           </w:p>
         </w:tc>
@@ -676,10 +676,10 @@
         <w:rPr>
           <w:b/>
         </w:rPr>
-        <w:t xml:space="preserve">Standort U (unkritisch): </w:t>
+        <w:t xml:space="preserve">Standorte U1, U2 und U3 (unkritisch): </w:t>
       </w:r>
       <w:r>
-        <w:t>eine echte Standortnummer, die die Automatik mit Konfiguration A zulässt (Kategorie 1, 1+ oder 2, kein Alleinversorger, Datenverkehr unter der Grenze, wenig angehängte Standorte). Sie muss in der Testumgebung vorhanden sein. Zur Kontrolle eine Anfrage einreichen und prüfen, ob die Automatik sie vormerkt.</w:t>
+        <w:t>je eine echte Standortnummer, die die Automatik mit Konfiguration A zulässt (Kategorie 1, 1+ oder 2, kein Alleinversorger, Datenverkehr höchstens 100 GB, keine angehängten Standorte über Router oder Richtfunk). Sie muss in der Testumgebung vorhanden sein. Zur Kontrolle eine Anfrage einreichen und prüfen, ob die Automatik sie vormerkt. U1 gilt für TF 1, TF 4 und TF 5, U2 für TF 2, U3 für TF 3. Drei Standorte sind nötig, weil die Anomalieerkennung TF 1 bis TF 3 an einem Standort an aufeinanderfolgenden Tagen als Stückelung und zusammen mit TF 4 und TF 5 als Häufung werten würde. Die Kontrollanfragen danach löschen, sonst zählen sie als Nachbarn mit.</w:t>
       </w:r>
     </w:p>
     <w:p>
@@ -764,10 +764,10 @@
         <w:rPr>
           <w:b/>
         </w:rPr>
-        <w:t xml:space="preserve">TSM-Ersatz: </w:t>
+        <w:t xml:space="preserve">Kein TSM-Ersatz: </w:t>
       </w:r>
       <w:r>
-        <w:t>eine Excel-Tabelle mit denselben Feldern und derselben Reihenfolge wie die Eingabemaske im TSM. Für jeden Durchgang eine frische Kopie.</w:t>
+        <w:t>Die CC-Person tippt im Test nichts ab. Die Übertragung ins TSM wird getrennt im Betrieb beobachtet (Abschnitt 3.5).</w:t>
       </w:r>
     </w:p>
     <w:p>
@@ -797,7 +797,13 @@
         <w:pStyle w:val="ListBullet"/>
       </w:pPr>
       <w:r>
-        <w:t>Testkonten anlegen: ein GU-Konto (mit zweitem Faktor, Gerät der GU-Person) und ein CC-Konto je CC-Person.</w:t>
+        <w:rPr>
+          <w:b/>
+        </w:rPr>
+        <w:t xml:space="preserve">Testkonten anlegen: </w:t>
+      </w:r>
+      <w:r>
+        <w:t>ein GU-Konto und zwei CC-Konten. GU-Konto über die Registrierung im GU-Panel (Firma „Muster Bau GmbH“, Name „Test GU“), im Admin-Panel genehmigen, Passwort über den Link in der Mail setzen. Dafür eine E-Mail-Adresse nötig, auf die der Versuchsleiter Zugriff hat. CC-Konten im Admin-Panel als TicketSpecialist mit Spezialisierung CRQs anlegen („Test CC 1“ für Durchgang A, „Test CC 2“ für Durchgang B), vorläufiges Passwort beim ersten Login ändern. Den zweiten Faktor aller drei Konten in der Authenticator-App des Versuchsleiters einrichten und die Konten vor dem Termin auf den Rechnern der GU- und der CC-Person anmelden. Die Anmeldung gehört nicht zur Messung. Läuft eine Sitzung während des Termins ab, meldet der Versuchsleiter neu an und notiert das als Eingriff. Nach dem letzten Durchgang alle drei Konten löschen.</w:t>
       </w:r>
     </w:p>
     <w:p>
@@ -808,7 +814,7 @@
         <w:rPr>
           <w:b/>
         </w:rPr>
-        <w:t xml:space="preserve">Automatik in der Testumgebung einschalten, Konfiguration A: </w:t>
+        <w:t xml:space="preserve">Automatik in der Testumgebung auf Konfiguration A einstellen, aber erst nach den Vorab-Anfragen einschalten (siehe unten): </w:t>
       </w:r>
       <w:r>
         <w:t>Tätigkeit „ASI Abschaltung“, Kategorien 1, 1+ und 2 freigegeben, übrige Bedingungen auf Voreinstellung (höchstens 60 Minuten SA-Dauer, höchstens sechs Tage, mindestens 72 Stunden Vorlauf).</w:t>
@@ -833,7 +839,7 @@
         <w:t xml:space="preserve">Vorab einreichen: </w:t>
       </w:r>
       <w:r>
-        <w:t>die ursprüngliche Anfrage für TF 4 (Status Neu) und die ursprüngliche Anfrage für TF 5 (validiert und an die Ersatzimplementierung übertragen). Auf dem alten Weg entsprechend die erste E-Mail zu TF 4 und die erste E-Mail samt Eintrag im TSM-Ersatz zu TF 5.</w:t>
+        <w:t>die ursprüngliche Anfrage für TF 4 (Status Neu) und die ursprüngliche Anfrage für TF 5 (validiert und an die Ersatzimplementierung übertragen). Auf dem alten Weg entsprechend die erste E-Mail zu TF 4 und die erste E-Mail zu TF 5, die als schon ins TSM übertragen gilt. Beide an U1 und bei ausgeschalteter Automatik, sonst merkt sie TF 4 vor und überträgt sie beim nächsten Lauf. TF 5 von Hand validieren, der nächste Lauf um 5, 12 oder 19 Uhr überträgt sie. Erst danach die Automatik einschalten.</w:t>
       </w:r>
     </w:p>
     <w:p>
@@ -914,13 +920,82 @@
               <w:rPr>
                 <w:sz w:val="19"/>
               </w:rPr>
-              <w:t>Alle Testanfragen des ersten Durchgangs im Admin-Panel löschen, das Testpostfach leeren und einen frischen TSM-Ersatz nehmen. Sonst überschneiden sich die Zeiträume am selben Standort, und die Anomalieerkennung bzw. AdHoc behandelt die neuen Anfragen als Korrektur.</w:t>
+              <w:t>Alle Testanfragen des ersten Durchgangs im Admin-Panel löschen und das Testpostfach leeren. Sonst überschneiden sich die Zeiträume am selben Standort, und die Anomalieerkennung bzw. AdHoc behandelt die neuen Anfragen als Korrektur. Danach die Automatik ausschalten, TF 4 und TF 5 wie in 3.3 neu einreichen und die Automatik wieder einschalten. Zwischen dem Einreichen von TF 5 und Durchgang B muss ein Übertragungslauf liegen, deshalb Durchgang A am Vormittag und Durchgang B am Nachmittag.</w:t>
             </w:r>
           </w:p>
         </w:tc>
       </w:tr>
     </w:tbl>
     <w:p/>
+    <w:p>
+      <w:pPr>
+        <w:pStyle w:val="Heading2"/>
+      </w:pPr>
+      <w:r>
+        <w:t>3.5  Beobachtung der Übertragung ins TSM</w:t>
+      </w:r>
+    </w:p>
+    <w:p>
+      <w:r>
+        <w:t>Testdaten dürfen nicht ins TSM. Wie lange das Abtippen dauert und ob dabei Fehler entstehen, wird deshalb im laufenden Betrieb an echten Anfragen beobachtet. Die Werte gelten für den alten Weg und für „neu heute“.</w:t>
+      </w:r>
+    </w:p>
+    <w:p>
+      <w:pPr>
+        <w:pStyle w:val="ListBullet"/>
+      </w:pPr>
+      <w:r>
+        <w:rPr>
+          <w:b/>
+        </w:rPr>
+        <w:t xml:space="preserve">Wann: </w:t>
+      </w:r>
+      <w:r>
+        <w:t>vor dem Testtermin, bei 5 bis 10 echten Anfragen. Die CC-Person vorher fragen, ob sie einverstanden ist.</w:t>
+      </w:r>
+    </w:p>
+    <w:p>
+      <w:pPr>
+        <w:pStyle w:val="ListBullet"/>
+      </w:pPr>
+      <w:r>
+        <w:rPr>
+          <w:b/>
+        </w:rPr>
+        <w:t xml:space="preserve">Messung: </w:t>
+      </w:r>
+      <w:r>
+        <w:t>vom ersten bis zum letzten Feld im TSM, mit derselben Stoppuhr wie im Test. Unterbrechungen durch andere Arbeit zählen nicht mit.</w:t>
+      </w:r>
+    </w:p>
+    <w:p>
+      <w:pPr>
+        <w:pStyle w:val="ListBullet"/>
+      </w:pPr>
+      <w:r>
+        <w:rPr>
+          <w:b/>
+        </w:rPr>
+        <w:t xml:space="preserve">Notieren: </w:t>
+      </w:r>
+      <w:r>
+        <w:t>je Anfrage Start, Ende, Zahl der Ausfalltage und ob der TSM-Eintrag vom Template abweicht (Blatt Beobachtung TSM im Protokoll).</w:t>
+      </w:r>
+    </w:p>
+    <w:p>
+      <w:pPr>
+        <w:pStyle w:val="ListBullet"/>
+      </w:pPr>
+      <w:r>
+        <w:rPr>
+          <w:b/>
+        </w:rPr>
+        <w:t xml:space="preserve">Datenschutz: </w:t>
+      </w:r>
+      <w:r>
+        <w:t>nur Kürzel, Uhrzeiten und Anzahlen notieren. Keine Standortnummern, Namen oder andere Angaben aus den echten Anfragen.</w:t>
+      </w:r>
+    </w:p>
     <w:p>
       <w:pPr>
         <w:pStyle w:val="Heading1"/>
@@ -1145,7 +1220,7 @@
                 <w:b/>
                 <w:sz w:val="19"/>
               </w:rPr>
-              <w:t>Abtippen TSM-Ersatz</w:t>
+              <w:t>Abtippen TSM (nur Beobachtung, 3.5)</w:t>
             </w:r>
           </w:p>
         </w:tc>
@@ -1159,7 +1234,7 @@
               <w:rPr>
                 <w:sz w:val="19"/>
               </w:rPr>
-              <w:t>erstes Feld im TSM-Ersatz</w:t>
+              <w:t>erstes Feld im TSM</w:t>
             </w:r>
           </w:p>
         </w:tc>
@@ -2130,7 +2205,7 @@
         <w:t xml:space="preserve">Ziel: </w:t>
       </w:r>
       <w:r>
-        <w:t>Zeigt den Aufwand im Normalfall und ob beim Abtippen ins TSM Übertragungsfehler entstehen.</w:t>
+        <w:t>Zeigt den Aufwand für Eingabe und Prüfung im Normalfall. Aufwand und Fehler beim Abtippen ins TSM kommen aus der Beobachtung (3.5).</w:t>
       </w:r>
     </w:p>
     <w:p>
@@ -2226,7 +2301,7 @@
               <w:rPr>
                 <w:sz w:val="19"/>
               </w:rPr>
-              <w:t>Standort U</w:t>
+              <w:t>Standort U1</w:t>
             </w:r>
           </w:p>
         </w:tc>
@@ -2495,20 +2570,6 @@
     </w:p>
     <w:p>
       <w:pPr>
-        <w:tabs>
-          <w:tab w:pos="425" w:val="left"/>
-        </w:tabs>
-        <w:spacing w:after="60"/>
-        <w:ind w:left="425" w:hanging="425"/>
-      </w:pPr>
-      <w:r>
-        <w:t>3.</w:t>
-        <w:tab/>
-        <w:t>CC tippt die Angaben in den TSM-Ersatz.</w:t>
-      </w:r>
-    </w:p>
-    <w:p>
-      <w:pPr>
         <w:pStyle w:val="Heading3"/>
       </w:pPr>
       <w:r>
@@ -2545,20 +2606,6 @@
     </w:p>
     <w:p>
       <w:pPr>
-        <w:tabs>
-          <w:tab w:pos="425" w:val="left"/>
-        </w:tabs>
-        <w:spacing w:after="60"/>
-        <w:ind w:left="425" w:hanging="425"/>
-      </w:pPr>
-      <w:r>
-        <w:t>3.</w:t>
-        <w:tab/>
-        <w:t>Zusätzlich (Variante „neu heute“): CC tippt die Angaben aus dem CC-Panel in den TSM-Ersatz.</w:t>
-      </w:r>
-    </w:p>
-    <w:p>
-      <w:pPr>
         <w:pStyle w:val="Heading3"/>
       </w:pPr>
       <w:r>
@@ -2623,7 +2670,7 @@
               <w:rPr>
                 <w:sz w:val="19"/>
               </w:rPr>
-              <w:t>Anfrage geprüft und im TSM-Ersatz. Möglich: Tippfehler beim Abtippen.</w:t>
+              <w:t>Anfrage geprüft und zur Übertragung bereit. Abtippen und mögliche Tippfehler kommen aus der Beobachtung (3.5).</w:t>
             </w:r>
           </w:p>
         </w:tc>
@@ -2665,15 +2712,7 @@
         <w:pStyle w:val="ListBullet"/>
       </w:pPr>
       <w:r>
-        <w:t>Abtippen auf beiden Wegen getrennt messen.</w:t>
-      </w:r>
-    </w:p>
-    <w:p>
-      <w:pPr>
-        <w:pStyle w:val="ListBullet"/>
-      </w:pPr>
-      <w:r>
-        <w:t>Jeder Unterschied zwischen TSM-Ersatz und Karte als Fehler (Korrektheit, aufgefallen: gar nicht).</w:t>
+        <w:t>Jeder Unterschied zwischen Template bzw. Anfrage und Karte als Fehler (Korrektheit, aufgefallen: gar nicht).</w:t>
       </w:r>
     </w:p>
     <w:p>
@@ -2793,7 +2832,7 @@
               <w:rPr>
                 <w:sz w:val="19"/>
               </w:rPr>
-              <w:t>Standort U</w:t>
+              <w:t>Standort U2</w:t>
             </w:r>
           </w:p>
         </w:tc>
@@ -3058,20 +3097,6 @@
         <w:t>2.</w:t>
         <w:tab/>
         <w:t>CC prüft. Fällt die Lücke auf, klärt die CC-Person sie mit dem GU per Mail oder Telefon. Erst dann gibt der Versuchsleiter der GU-Person den Zettel mit der Nummer.</w:t>
-      </w:r>
-    </w:p>
-    <w:p>
-      <w:pPr>
-        <w:tabs>
-          <w:tab w:pos="425" w:val="left"/>
-        </w:tabs>
-        <w:spacing w:after="60"/>
-        <w:ind w:left="425" w:hanging="425"/>
-      </w:pPr>
-      <w:r>
-        <w:t>3.</w:t>
-        <w:tab/>
-        <w:t>CC tippt die Angaben in den TSM-Ersatz.</w:t>
       </w:r>
     </w:p>
     <w:p>
@@ -3190,7 +3215,7 @@
               <w:rPr>
                 <w:sz w:val="19"/>
               </w:rPr>
-              <w:t>Lücke fällt bei der Prüfung oder erst beim Abtippen auf, oder gar nicht. Rückfrage nötig.</w:t>
+              <w:t>Lücke fällt bei der Prüfung auf oder gar nicht. Rückfrage nötig.</w:t>
             </w:r>
           </w:p>
         </w:tc>
@@ -3224,7 +3249,7 @@
         <w:pStyle w:val="ListBullet"/>
       </w:pPr>
       <w:r>
-        <w:t>Wo die Lücke auffällt (Formular, CC bei Prüfung, CC beim Abtippen, gar nicht).</w:t>
+        <w:t>Wo die Lücke auffällt (Formular, CC bei Prüfung, gar nicht).</w:t>
       </w:r>
     </w:p>
     <w:p>
@@ -3360,7 +3385,7 @@
               <w:rPr>
                 <w:sz w:val="19"/>
               </w:rPr>
-              <w:t>Standort U</w:t>
+              <w:t>Standort U3</w:t>
             </w:r>
           </w:p>
         </w:tc>
@@ -3656,21 +3681,7 @@
       <w:r>
         <w:t>2.</w:t>
         <w:tab/>
-        <w:t>CC prüft. Bemerkt sie die Abweichung? Welche Nummer übernimmt sie?</w:t>
-      </w:r>
-    </w:p>
-    <w:p>
-      <w:pPr>
-        <w:tabs>
-          <w:tab w:pos="425" w:val="left"/>
-        </w:tabs>
-        <w:spacing w:after="60"/>
-        <w:ind w:left="425" w:hanging="425"/>
-      </w:pPr>
-      <w:r>
-        <w:t>3.</w:t>
-        <w:tab/>
-        <w:t>CC tippt die Angaben in den TSM-Ersatz.</w:t>
+        <w:t>CC prüft. Bemerkt sie die Abweichung? Sie schreibt auf, welche Nummer sie ins TSM übernehmen würde.</w:t>
       </w:r>
     </w:p>
     <w:p>
@@ -3789,7 +3800,7 @@
               <w:rPr>
                 <w:sz w:val="19"/>
               </w:rPr>
-              <w:t>Abweichung fällt auf (Rückfrage) oder nicht. Im schlimmsten Fall landet die falsche Nummer im TSM-Ersatz.</w:t>
+              <w:t>Abweichung fällt auf (Rückfrage) oder nicht. Im schlimmsten Fall würde die falsche Nummer ins TSM übernommen.</w:t>
             </w:r>
           </w:p>
         </w:tc>
@@ -3823,7 +3834,7 @@
         <w:pStyle w:val="ListBullet"/>
       </w:pPr>
       <w:r>
-        <w:t>Welche Nummer im TSM-Ersatz bzw. in der Anfrage steht.</w:t>
+        <w:t>Welche Nummer die CC-Person ins TSM übernehmen würde bzw. in der Anfrage steht.</w:t>
       </w:r>
     </w:p>
     <w:p>
@@ -3959,7 +3970,7 @@
               <w:rPr>
                 <w:sz w:val="19"/>
               </w:rPr>
-              <w:t>Standort U</w:t>
+              <w:t>Standort U1</w:t>
             </w:r>
           </w:p>
         </w:tc>
@@ -4237,7 +4248,7 @@
       <w:r>
         <w:t>3.</w:t>
         <w:tab/>
-        <w:t>CC prüft und überträgt die Korrektur in den TSM-Ersatz.</w:t>
+        <w:t>CC prüft und schreibt auf, welchen Zeitraum sie ins TSM übernehmen würde.</w:t>
       </w:r>
     </w:p>
     <w:p>
@@ -4376,7 +4387,7 @@
         <w:pStyle w:val="ListBullet"/>
       </w:pPr>
       <w:r>
-        <w:t>Welcher Zeitraum am Ende im TSM-Ersatz bzw. in der Anfrage steht.</w:t>
+        <w:t>Welchen Zeitraum die CC-Person ins TSM übernehmen würde bzw. welcher in der Anfrage steht.</w:t>
       </w:r>
     </w:p>
     <w:p>
@@ -4464,7 +4475,7 @@
         <w:t xml:space="preserve">Vorbedingung: </w:t>
       </w:r>
       <w:r>
-        <w:t>Die ursprüngliche Anfrage (TF 5 ursprünglich) ist auf beiden Wegen schon übertragen: alt im TSM-Ersatz eingetragen, neu an die Ersatzimplementierung übertragen.</w:t>
+        <w:t>Die ursprüngliche Anfrage (TF 5 ursprünglich) ist auf beiden Wegen schon übertragen: alt per E-Mail eingegangen und als schon ins TSM übertragen behandelt, neu an die Ersatzimplementierung übertragen.</w:t>
       </w:r>
     </w:p>
     <w:p>
@@ -4549,7 +4560,7 @@
               <w:rPr>
                 <w:sz w:val="19"/>
               </w:rPr>
-              <w:t>Standort U</w:t>
+              <w:t>Standort U1</w:t>
             </w:r>
           </w:p>
         </w:tc>
@@ -5403,20 +5414,6 @@
     </w:p>
     <w:p>
       <w:pPr>
-        <w:tabs>
-          <w:tab w:pos="425" w:val="left"/>
-        </w:tabs>
-        <w:spacing w:after="60"/>
-        <w:ind w:left="425" w:hanging="425"/>
-      </w:pPr>
-      <w:r>
-        <w:t>3.</w:t>
-        <w:tab/>
-        <w:t>CC tippt die Angaben in den TSM-Ersatz.</w:t>
-      </w:r>
-    </w:p>
-    <w:p>
-      <w:pPr>
         <w:pStyle w:val="Heading3"/>
       </w:pPr>
       <w:r>
@@ -5453,20 +5450,6 @@
     </w:p>
     <w:p>
       <w:pPr>
-        <w:tabs>
-          <w:tab w:pos="425" w:val="left"/>
-        </w:tabs>
-        <w:spacing w:after="60"/>
-        <w:ind w:left="425" w:hanging="425"/>
-      </w:pPr>
-      <w:r>
-        <w:t>3.</w:t>
-        <w:tab/>
-        <w:t>Zusätzlich (Variante „neu heute“): CC tippt die Angaben aus dem CC-Panel in den TSM-Ersatz.</w:t>
-      </w:r>
-    </w:p>
-    <w:p>
-      <w:pPr>
         <w:pStyle w:val="Heading3"/>
       </w:pPr>
       <w:r>
@@ -5574,14 +5557,6 @@
       </w:pPr>
       <w:r>
         <w:t>Grund, den das System an der Anfrage anzeigt.</w:t>
-      </w:r>
-    </w:p>
-    <w:p>
-      <w:pPr>
-        <w:pStyle w:val="ListBullet"/>
-      </w:pPr>
-      <w:r>
-        <w:t>Abtippen auf beiden Wegen getrennt messen.</w:t>
       </w:r>
     </w:p>
     <w:p>
@@ -5768,7 +5743,7 @@
               <w:rPr>
                 <w:sz w:val="19"/>
               </w:rPr>
-              <w:t>Durchläufe</w:t>
+              <w:t>Durchläufe und Beobachtung TSM</w:t>
             </w:r>
           </w:p>
         </w:tc>
@@ -6062,7 +6037,7 @@
         <w:pStyle w:val="ListBullet"/>
       </w:pPr>
       <w:r>
-        <w:t>Statt ins echte TSM trägst du die Angaben in den TSM-Ersatz ein (Excel-Tabelle mit denselben Feldern).</w:t>
+        <w:t>Ins TSM trägst du im Test nichts ein. Sag am Ende jeder Anfrage kurz, ob und mit welchen Angaben du sie ins TSM übernehmen würdest.</w:t>
       </w:r>
     </w:p>
     <w:p>
@@ -6071,14 +6046,6 @@
       </w:pPr>
       <w:r>
         <w:t>Neuer Weg: Die Anfragen erscheinen im CC-Panel. Rückfragen stellst du über den Chat am Vorgang.</w:t>
-      </w:r>
-    </w:p>
-    <w:p>
-      <w:pPr>
-        <w:pStyle w:val="ListBullet"/>
-      </w:pPr>
-      <w:r>
-        <w:t>Bei zwei Anfragen im neuen System wirst du zusätzlich gebeten, die Angaben in den TSM-Ersatz zu tippen. So arbeitet die BayFu, bis die Schnittstelle zu Telefónica fertig ist.</w:t>
       </w:r>
     </w:p>
     <w:p>
@@ -6116,7 +6083,7 @@
           <w:b w:val="0"/>
           <w:i w:val="0"/>
         </w:rPr>
-        <w:t>Je Testfall gibt es eine Karte für den alten und eine für den neuen Weg. Die Karten nennen keine eingebauten Fehler. Die Felder mit Linie füllt der Versuchsleiter vor dem Termin aus dem Blatt Testdaten aus.</w:t>
+        <w:t>Je Testfall gibt es eine Karte für den alten und eine für den neuen Weg. Die Karten nennen keine eingebauten Fehler. Standortnummern und Daten sind aus dem Blatt Testdaten vorausgefüllt (Testtag 19.10.2026). Ändert sich der Testtag, müssen sie neu übertragen werden.</w:t>
       </w:r>
     </w:p>
     <w:p>
@@ -6226,7 +6193,7 @@
               <w:rPr>
                 <w:sz w:val="19"/>
               </w:rPr>
-              <w:t>______________________________</w:t>
+              <w:t>120990497</w:t>
             </w:r>
           </w:p>
         </w:tc>
@@ -6418,7 +6385,7 @@
               <w:rPr>
                 <w:sz w:val="19"/>
               </w:rPr>
-              <w:t>______________________________</w:t>
+              <w:t>Mo, 26.10.2026</w:t>
             </w:r>
           </w:p>
         </w:tc>
@@ -6489,16 +6456,6 @@
       </w:tr>
     </w:tbl>
     <w:p/>
-    <w:p>
-      <w:r>
-        <w:rPr>
-          <w:b w:val="0"/>
-          <w:i/>
-          <w:sz w:val="17"/>
-        </w:rPr>
-        <w:t>Datum und Uhrzeit: aus dem Blatt Testdaten übertragen, bevor die Karte ausgegeben wird.</w:t>
-      </w:r>
-    </w:p>
     <w:p>
       <w:r>
         <w:br w:type="page"/>
@@ -6606,7 +6563,7 @@
               <w:rPr>
                 <w:sz w:val="19"/>
               </w:rPr>
-              <w:t>______________________________</w:t>
+              <w:t>120990497</w:t>
             </w:r>
           </w:p>
         </w:tc>
@@ -6798,7 +6755,7 @@
               <w:rPr>
                 <w:sz w:val="19"/>
               </w:rPr>
-              <w:t>______________________________</w:t>
+              <w:t>Mo, 26.10.2026</w:t>
             </w:r>
           </w:p>
         </w:tc>
@@ -6869,16 +6826,6 @@
       </w:tr>
     </w:tbl>
     <w:p/>
-    <w:p>
-      <w:r>
-        <w:rPr>
-          <w:b w:val="0"/>
-          <w:i/>
-          <w:sz w:val="17"/>
-        </w:rPr>
-        <w:t>Datum und Uhrzeit: aus dem Blatt Testdaten übertragen, bevor die Karte ausgegeben wird.</w:t>
-      </w:r>
-    </w:p>
     <w:p>
       <w:r>
         <w:br w:type="page"/>
@@ -6986,7 +6933,7 @@
               <w:rPr>
                 <w:sz w:val="19"/>
               </w:rPr>
-              <w:t>______________________________</w:t>
+              <w:t>120990539</w:t>
             </w:r>
           </w:p>
         </w:tc>
@@ -7178,7 +7125,7 @@
               <w:rPr>
                 <w:sz w:val="19"/>
               </w:rPr>
-              <w:t>______________________________</w:t>
+              <w:t>Di, 27.10.2026</w:t>
             </w:r>
           </w:p>
         </w:tc>
@@ -7249,16 +7196,6 @@
       </w:tr>
     </w:tbl>
     <w:p/>
-    <w:p>
-      <w:r>
-        <w:rPr>
-          <w:b w:val="0"/>
-          <w:i/>
-          <w:sz w:val="17"/>
-        </w:rPr>
-        <w:t>Datum und Uhrzeit: aus dem Blatt Testdaten übertragen, bevor die Karte ausgegeben wird.</w:t>
-      </w:r>
-    </w:p>
     <w:p>
       <w:r>
         <w:br w:type="page"/>
@@ -7366,7 +7303,7 @@
               <w:rPr>
                 <w:sz w:val="19"/>
               </w:rPr>
-              <w:t>______________________________</w:t>
+              <w:t>120990539</w:t>
             </w:r>
           </w:p>
         </w:tc>
@@ -7558,7 +7495,7 @@
               <w:rPr>
                 <w:sz w:val="19"/>
               </w:rPr>
-              <w:t>______________________________</w:t>
+              <w:t>Di, 27.10.2026</w:t>
             </w:r>
           </w:p>
         </w:tc>
@@ -7629,16 +7566,6 @@
       </w:tr>
     </w:tbl>
     <w:p/>
-    <w:p>
-      <w:r>
-        <w:rPr>
-          <w:b w:val="0"/>
-          <w:i/>
-          <w:sz w:val="17"/>
-        </w:rPr>
-        <w:t>Datum und Uhrzeit: aus dem Blatt Testdaten übertragen, bevor die Karte ausgegeben wird.</w:t>
-      </w:r>
-    </w:p>
     <w:p>
       <w:r>
         <w:br w:type="page"/>
@@ -7746,7 +7673,7 @@
               <w:rPr>
                 <w:sz w:val="19"/>
               </w:rPr>
-              <w:t>______________________________</w:t>
+              <w:t>121990047</w:t>
             </w:r>
           </w:p>
         </w:tc>
@@ -7778,7 +7705,7 @@
               <w:rPr>
                 <w:sz w:val="19"/>
               </w:rPr>
-              <w:t>______________________________</w:t>
+              <w:t>121990074</w:t>
             </w:r>
           </w:p>
         </w:tc>
@@ -7970,7 +7897,7 @@
               <w:rPr>
                 <w:sz w:val="19"/>
               </w:rPr>
-              <w:t>______________________________</w:t>
+              <w:t>Mi, 28.10.2026</w:t>
             </w:r>
           </w:p>
         </w:tc>
@@ -8041,16 +7968,6 @@
       </w:tr>
     </w:tbl>
     <w:p/>
-    <w:p>
-      <w:r>
-        <w:rPr>
-          <w:b w:val="0"/>
-          <w:i/>
-          <w:sz w:val="17"/>
-        </w:rPr>
-        <w:t>Datum und Uhrzeit: aus dem Blatt Testdaten übertragen, bevor die Karte ausgegeben wird.</w:t>
-      </w:r>
-    </w:p>
     <w:p>
       <w:r>
         <w:br w:type="page"/>
@@ -8158,7 +8075,7 @@
               <w:rPr>
                 <w:sz w:val="19"/>
               </w:rPr>
-              <w:t>______________________________</w:t>
+              <w:t>121990047</w:t>
             </w:r>
           </w:p>
         </w:tc>
@@ -8350,7 +8267,7 @@
               <w:rPr>
                 <w:sz w:val="19"/>
               </w:rPr>
-              <w:t>______________________________</w:t>
+              <w:t>Mi, 28.10.2026</w:t>
             </w:r>
           </w:p>
         </w:tc>
@@ -8421,16 +8338,6 @@
       </w:tr>
     </w:tbl>
     <w:p/>
-    <w:p>
-      <w:r>
-        <w:rPr>
-          <w:b w:val="0"/>
-          <w:i/>
-          <w:sz w:val="17"/>
-        </w:rPr>
-        <w:t>Datum und Uhrzeit: aus dem Blatt Testdaten übertragen, bevor die Karte ausgegeben wird.</w:t>
-      </w:r>
-    </w:p>
     <w:p>
       <w:r>
         <w:br w:type="page"/>
@@ -8538,7 +8445,7 @@
               <w:rPr>
                 <w:sz w:val="19"/>
               </w:rPr>
-              <w:t>______________________________</w:t>
+              <w:t>120990497</w:t>
             </w:r>
           </w:p>
         </w:tc>
@@ -8570,7 +8477,7 @@
               <w:rPr>
                 <w:sz w:val="19"/>
               </w:rPr>
-              <w:t>______________________________</w:t>
+              <w:t>Mo, 09.11.2026 bis Mi, 11.11.2026</w:t>
             </w:r>
           </w:p>
         </w:tc>
@@ -8602,7 +8509,7 @@
               <w:rPr>
                 <w:sz w:val="19"/>
               </w:rPr>
-              <w:t>______________________________</w:t>
+              <w:t>Mo, 09.11.2026</w:t>
             </w:r>
           </w:p>
         </w:tc>
@@ -8641,16 +8548,6 @@
       </w:tr>
     </w:tbl>
     <w:p/>
-    <w:p>
-      <w:r>
-        <w:rPr>
-          <w:b w:val="0"/>
-          <w:i/>
-          <w:sz w:val="17"/>
-        </w:rPr>
-        <w:t>Datum und Uhrzeit: aus dem Blatt Testdaten übertragen, bevor die Karte ausgegeben wird.</w:t>
-      </w:r>
-    </w:p>
     <w:p>
       <w:r>
         <w:br w:type="page"/>
@@ -8758,7 +8655,7 @@
               <w:rPr>
                 <w:sz w:val="19"/>
               </w:rPr>
-              <w:t>______________________________</w:t>
+              <w:t>120990497</w:t>
             </w:r>
           </w:p>
         </w:tc>
@@ -8790,7 +8687,7 @@
               <w:rPr>
                 <w:sz w:val="19"/>
               </w:rPr>
-              <w:t>______________________________</w:t>
+              <w:t>Mo, 09.11.2026 bis Mi, 11.11.2026</w:t>
             </w:r>
           </w:p>
         </w:tc>
@@ -8822,7 +8719,7 @@
               <w:rPr>
                 <w:sz w:val="19"/>
               </w:rPr>
-              <w:t>______________________________</w:t>
+              <w:t>Mo, 09.11.2026</w:t>
             </w:r>
           </w:p>
         </w:tc>
@@ -8861,16 +8758,6 @@
       </w:tr>
     </w:tbl>
     <w:p/>
-    <w:p>
-      <w:r>
-        <w:rPr>
-          <w:b w:val="0"/>
-          <w:i/>
-          <w:sz w:val="17"/>
-        </w:rPr>
-        <w:t>Datum und Uhrzeit: aus dem Blatt Testdaten übertragen, bevor die Karte ausgegeben wird.</w:t>
-      </w:r>
-    </w:p>
     <w:p>
       <w:r>
         <w:br w:type="page"/>
@@ -8978,7 +8865,7 @@
               <w:rPr>
                 <w:sz w:val="19"/>
               </w:rPr>
-              <w:t>______________________________</w:t>
+              <w:t>120990497</w:t>
             </w:r>
           </w:p>
         </w:tc>
@@ -9010,7 +8897,7 @@
               <w:rPr>
                 <w:sz w:val="19"/>
               </w:rPr>
-              <w:t>______________________________</w:t>
+              <w:t>Mo, 16.11.2026 bis Mi, 18.11.2026</w:t>
             </w:r>
           </w:p>
         </w:tc>
@@ -9042,7 +8929,7 @@
               <w:rPr>
                 <w:sz w:val="19"/>
               </w:rPr>
-              <w:t>______________________________</w:t>
+              <w:t>Di, 17.11.2026 bis Do, 19.11.2026</w:t>
             </w:r>
           </w:p>
         </w:tc>
@@ -9241,16 +9128,6 @@
       </w:tr>
     </w:tbl>
     <w:p/>
-    <w:p>
-      <w:r>
-        <w:rPr>
-          <w:b w:val="0"/>
-          <w:i/>
-          <w:sz w:val="17"/>
-        </w:rPr>
-        <w:t>Datum und Uhrzeit: aus dem Blatt Testdaten übertragen, bevor die Karte ausgegeben wird.</w:t>
-      </w:r>
-    </w:p>
     <w:p>
       <w:r>
         <w:br w:type="page"/>
@@ -9358,7 +9235,7 @@
               <w:rPr>
                 <w:sz w:val="19"/>
               </w:rPr>
-              <w:t>______________________________</w:t>
+              <w:t>120990497</w:t>
             </w:r>
           </w:p>
         </w:tc>
@@ -9390,7 +9267,7 @@
               <w:rPr>
                 <w:sz w:val="19"/>
               </w:rPr>
-              <w:t>______________________________</w:t>
+              <w:t>Mo, 16.11.2026 bis Mi, 18.11.2026</w:t>
             </w:r>
           </w:p>
         </w:tc>
@@ -9422,7 +9299,7 @@
               <w:rPr>
                 <w:sz w:val="19"/>
               </w:rPr>
-              <w:t>______________________________</w:t>
+              <w:t>Di, 17.11.2026 bis Do, 19.11.2026</w:t>
             </w:r>
           </w:p>
         </w:tc>
@@ -9621,16 +9498,6 @@
       </w:tr>
     </w:tbl>
     <w:p/>
-    <w:p>
-      <w:r>
-        <w:rPr>
-          <w:b w:val="0"/>
-          <w:i/>
-          <w:sz w:val="17"/>
-        </w:rPr>
-        <w:t>Datum und Uhrzeit: aus dem Blatt Testdaten übertragen, bevor die Karte ausgegeben wird.</w:t>
-      </w:r>
-    </w:p>
     <w:p>
       <w:r>
         <w:br w:type="page"/>
@@ -9738,7 +9605,7 @@
               <w:rPr>
                 <w:sz w:val="19"/>
               </w:rPr>
-              <w:t>______________________________</w:t>
+              <w:t>120990686</w:t>
             </w:r>
           </w:p>
         </w:tc>
@@ -9930,7 +9797,7 @@
               <w:rPr>
                 <w:sz w:val="19"/>
               </w:rPr>
-              <w:t>______________________________</w:t>
+              <w:t>Mo, 09.11.2026</w:t>
             </w:r>
           </w:p>
         </w:tc>
@@ -9962,7 +9829,7 @@
               <w:rPr>
                 <w:sz w:val="19"/>
               </w:rPr>
-              <w:t>______________________________</w:t>
+              <w:t>Mi, 18.11.2026</w:t>
             </w:r>
           </w:p>
         </w:tc>
@@ -10065,16 +9932,6 @@
       </w:tr>
     </w:tbl>
     <w:p/>
-    <w:p>
-      <w:r>
-        <w:rPr>
-          <w:b w:val="0"/>
-          <w:i/>
-          <w:sz w:val="17"/>
-        </w:rPr>
-        <w:t>Datum und Uhrzeit: aus dem Blatt Testdaten übertragen, bevor die Karte ausgegeben wird.</w:t>
-      </w:r>
-    </w:p>
     <w:p>
       <w:r>
         <w:br w:type="page"/>
@@ -10182,7 +10039,7 @@
               <w:rPr>
                 <w:sz w:val="19"/>
               </w:rPr>
-              <w:t>______________________________</w:t>
+              <w:t>120990686</w:t>
             </w:r>
           </w:p>
         </w:tc>
@@ -10374,7 +10231,7 @@
               <w:rPr>
                 <w:sz w:val="19"/>
               </w:rPr>
-              <w:t>______________________________</w:t>
+              <w:t>Mo, 09.11.2026</w:t>
             </w:r>
           </w:p>
         </w:tc>
@@ -10406,7 +10263,7 @@
               <w:rPr>
                 <w:sz w:val="19"/>
               </w:rPr>
-              <w:t>______________________________</w:t>
+              <w:t>Mi, 18.11.2026</w:t>
             </w:r>
           </w:p>
         </w:tc>
@@ -10509,16 +10366,6 @@
       </w:tr>
     </w:tbl>
     <w:p/>
-    <w:p>
-      <w:r>
-        <w:rPr>
-          <w:b w:val="0"/>
-          <w:i/>
-          <w:sz w:val="17"/>
-        </w:rPr>
-        <w:t>Datum und Uhrzeit: aus dem Blatt Testdaten übertragen, bevor die Karte ausgegeben wird.</w:t>
-      </w:r>
-    </w:p>
     <w:p>
       <w:r>
         <w:br w:type="page"/>

</xml_diff>

<commit_message>
BA: Session 19.10.2026 -- Testdurchlaeufe fertig vorbereitet, Excel-Templates, Druckvorlagen, Arbeitsprotokoll, Daily Note
Co-Authored-By: Claude Opus 5.5 <noreply@anthropic.com>
</commit_message>
<xml_diff>
--- a/02 Projekte/Bachelorarbeit/Testdurchläufe/Testfälle Testdurchläufe.docx
+++ b/02 Projekte/Bachelorarbeit/Testdurchläufe/Testfälle Testdurchläufe.docx
@@ -26,7 +26,7 @@
           <w:b w:val="0"/>
           <w:i w:val="0"/>
         </w:rPr>
-        <w:t>Bachelorarbeit Dennis Sacher, Evaluation (Kapitel 6). Stand: 15.10.2026</w:t>
+        <w:t>Bachelorarbeit Dennis Sacher, Evaluation (Kapitel 6). Stand: 19.10.2026</w:t>
       </w:r>
     </w:p>
     <w:p>
@@ -731,7 +731,7 @@
         <w:pStyle w:val="ListBullet"/>
       </w:pPr>
       <w:r>
-        <w:t>Anonymisiertes Excel-Template wie in Abbildung 4.2, ausgedruckt nicht nötig, als Datei auf dem Rechner der GU-Person.</w:t>
+        <w:t>Anonymisiertes Excel-Template wie in Abbildung 4.2 (Version 1.51), als Datei auf dem Rechner der GU-Person, nicht ausgedruckt. Die Dateien liegen im Ordner „Excel-Templates“: „Template alter Weg.xlsx“ für TF 1, TF 3, TF 5 und TF 6, „Template TF 2.xlsx“ für TF 2 (in den Auswahllisten fehlt die Telefonnummer der Technikerin) und „Template TF 4 ursprünglich.xlsx“ für TF 4.</w:t>
       </w:r>
     </w:p>
     <w:p>
@@ -745,7 +745,7 @@
         <w:t xml:space="preserve">TF 4: </w:t>
       </w:r>
       <w:r>
-        <w:t>Template mit drei ausgefüllten Ausfalltagen vorbereiten und prüfen, dass es sich wie das Original verhält: Wird die Zahl der Ausfalltage verringert, blendet Excel die überzähligen Zeilen nur aus.</w:t>
+        <w:t>Template mit drei ausgefüllten Ausfalltagen liegt bereit. Am 19.10.2026 geprüft: Wird die Zahl der Ausfalltage verringert, bleiben die Angaben der überzähligen Tage stehen. Nur die Beschriftung „Tag 2“ und „Tag 3“ wird weiß, und die Zusammenfassung im Template nennt nur noch einen Tag.</w:t>
       </w:r>
     </w:p>
     <w:p>
@@ -4234,7 +4234,7 @@
       <w:r>
         <w:t>2.</w:t>
         <w:tab/>
-        <w:t>Excel blendet die beiden überzähligen Zeilen nur aus. Mit AdHoc: Es liest alle Zeilen. Ohne AdHoc: CC liest die Mail direkt.</w:t>
+        <w:t>Die Angaben der beiden überzähligen Tage bleiben stehen, nur ihre Beschriftung wird weiß. Mit AdHoc: Es liest alle Zeilen. Ohne AdHoc: CC liest die Mail direkt.</w:t>
       </w:r>
     </w:p>
     <w:p>
@@ -4436,7 +4436,7 @@
               <w:rPr>
                 <w:sz w:val="19"/>
               </w:rPr>
-              <w:t>Die Template-Datei vorher testen. Der Fall funktioniert nur, wenn Excel die Zeilen wirklich ausblendet und nicht löscht.</w:t>
+              <w:t>Der Fall funktioniert nur, wenn die Angaben der überzähligen Tage nach dem Verringern stehen bleiben. Mit „Template TF 4 ursprünglich.xlsx“ am 19.10.2026 geprüft.</w:t>
             </w:r>
           </w:p>
         </w:tc>
@@ -5395,7 +5395,7 @@
       <w:r>
         <w:t>1.</w:t>
         <w:tab/>
-        <w:t>GU füllt das Template mit zehn Tageszeilen aus und sendet es.</w:t>
+        <w:t>GU trägt die ersten fünf Tage unter Punkt 7 ein und die Tage 6 bis 10 unter Punkt 12 (Sonstige Bemerkungen), dann sendet die GU-Person das Template. Mehr als fünf Tage lässt das Template nicht zu.</w:t>
       </w:r>
     </w:p>
     <w:p>
@@ -9528,7 +9528,7 @@
         <w:t xml:space="preserve">Dein Auftrag: </w:t>
       </w:r>
       <w:r>
-        <w:t>Fülle das Excel-Template mit diesen Angaben aus und schicke es per E-Mail an das Testpostfach. Schreib die Standortnummer in den Betreff.</w:t>
+        <w:t>Fülle das Excel-Template mit diesen Angaben aus und schicke es per E-Mail an das Testpostfach. Schreib die Standortnummer in den Betreff. Das Template hat Platz für höchstens fünf Tage. Trag die übrigen Tage unter Punkt 12 (Sonstige Bemerkungen) ein.</w:t>
       </w:r>
     </w:p>
     <w:tbl>

</xml_diff>